<commit_message>
docs: revise paper 1 background with 2017 release date, security shortcomings, and rigorous references
</commit_message>
<xml_diff>
--- a/docs/modernization/Draft_Artikel_Modernisasi_Arteri2.docx
+++ b/docs/modernization/Draft_Artikel_Modernisasi_Arteri2.docx
@@ -163,7 +163,7 @@
           <w:rFonts w:ascii="Times New Roman" w:hAnsi="Times New Roman"/>
           <w:sz w:val="22"/>
         </w:rPr>
-        <w:t>Pengelolaan arsip dinamis dan inaktif di lingkungan sektor publik menuntut keandalan sistem informasi kearsipan yang mampu menjamin integritas, keotentikan, dan keteraksesan data dalam jangka panjang. Pada pertengahan dekade 2010-an, banyak instansi dan komunitas kearsipan di Indonesia memanfaatkan aplikasi sistem informasi berbasis web sumber terbuka, salah satunya adalah Arteri generasi pertama (Arteri-1). Arteri-1 dirancang sebagai aplikasi pencatatan dan penataan berkas arsip menggunakan kerangka kerja CodeIgniter 3 dengan lingkungan runtime PHP 5.6 hingga PHP 7.x.</w:t>
+        <w:t>Pengelolaan arsip dinamis dan inaktif di lingkungan sektor publik menuntut keandalan sistem informasi kearsipan yang mampu menjamin integritas, keotentikan, kerahasiaan, dan keteraksesan data dalam jangka panjang. Pada tahun 2017, aplikasi sistem informasi kearsipan berbasis web sumber terbuka Arteri generasi pertama (Arteri-1) dirilis (https://github.com/dicarve/arteri). Arteri-1 dirancang sebagai perangkat lunak pencatatan, penataan, dan temu kembali berkas arsip yang dibangun menggunakan kerangka kerja CodeIgniter 3 dengan lingkungan runtime PHP 5.6 hingga PHP 7.x.</w:t>
       </w:r>
     </w:p>
     <w:p>
@@ -176,7 +176,7 @@
           <w:rFonts w:ascii="Times New Roman" w:hAnsi="Times New Roman"/>
           <w:sz w:val="22"/>
         </w:rPr>
-        <w:t>Meskipun Arteri-1 berhasil memfasilitasi kebutuhan dasar temu kembali arsip dan sirkulasi peminjaman, evolusi teknologi perangkat lunak dan standar keamanan siber menghadirkan tantangan eksistensial bagi keberlanjutan sistem tersebut. Berakhirnya masa dukungan (End-of-Life / EOL) runtime PHP 7.x serta penghentian pembaruan aktif pada kerangka kerja CodeIgniter 3 menuntut instansi pengguna untuk melakukan pembaruan lingkungan ke PHP 8.x. Namun, inkompatibilitas sintaksis dan arsitektur internal membuat sistem warisan Arteri-1 tidak dapat dijalankan secara langsung pada server modern tanpa mengalami kegagalan eksekusi (fatal runtime errors).</w:t>
+        <w:t>Kendati Arteri-1 berhasil memfasilitasi kebutuhan operasional dasar kearsipan dan sirkulasi peminjaman pada masa awal perilisannya, sistem tersebut memiliki berbagai kekurangan mendasar yang menjadikannya tidak lagi memadai untuk lanskap operasional dan keamanan saat ini. Seiring berjalannya waktu, akumulasi kekurangan teknis (technical debt) dan kerentanan keamanan (security vulnerabilities) pada Arteri-1 menjadi faktor pendorong utama dilakukannya rekayasa ulang menuju Arteri-2:\n1. Kerentanan Keamanan Kritis: Implementasi pengamanan pada Arteri-1 belum memenuhi standar keamanan web modern. Hal ini mencakup penggunaan algoritma hashing kata sandi usang (md5/sha1 tanpa salt yang kuat), proteksi CSRF yang tidak aktif secara default, penanganan kueri basis data parsial yang belum sepenuhnya menerapkan parameterized prepared statements (meningkatkan risiko SQL Injection), serta keterbatasan kontrol akses langsung terhadap berkas arsip digital.\n2. Ketiadaan Modul Jejak Audit (Audit Trail): Arteri-1 tidak memiliki modul pencatatan jejak aktivitas pengguna (system audit logging), padahal akuntabilitas dan pencatatan riwayat akses/modifikasi dokumen merupakan mandat kepatuhan standar tata kelola kearsipan (ISO 15489).\n3. Keterbatasan Ekosistem dan Interoperabilitas: Arteri-1 dibangun sebagai monolit tertutup tanpa dukungan antarmuka pemrograman aplikasi (RESTful API), sehingga menyulitkan integrasi data dengan ekosistem aplikasi lain di lingkungan instansi pemerintah (SPBE).\n4. Keusangan Tumpukan Teknologi (Technology Obsolescence): Berakhirnya masa dukungan resmi (End-of-Life / EOL) pada runtime PHP 5.6 dan PHP 7.x serta penghentian pengembangan aktif kerangka kerja CodeIgniter 3 menimbulkan risiko keamanan server dan inkompatibilitas fatal saat dijalankan pada infrastruktur server modern berbasis PHP 8.x.\n5. Ketiadaan Pengujian Otomatis (Automated Test Suite): Arteri-1 tidak dibekali mekanisme pengujian unit terotomatisasi, sehingga meningkatkan risiko regresi fungsi saat kode dipelihara.\n\nFaktor-faktor kelemahan fungsional, keamanan, dan keusangan tumpukan teknologi inilah yang mendasari urgensi pengembangan Arteri-2 melalui pendekatan rekayasa ulang perangkat lunak (software re-engineering).</w:t>
       </w:r>
     </w:p>
     <w:p>
@@ -204,7 +204,7 @@
           <w:rFonts w:ascii="Times New Roman" w:hAnsi="Times New Roman"/>
           <w:sz w:val="22"/>
         </w:rPr>
-        <w:t>Sesuai dengan Hukum Evolusi Perangkat Lunak Lehman (Lehman's Laws of Software Evolution), suatu program komputer yang digunakan di dunia nyata harus terus-menerus diadaptasikan atau program tersebut akan menjadi semakin tidak memadai dan usang (Lehman, 1996). Pada aplikasi kearsipan Arteri-1, akumulasi technical debt termanifestasi dalam beberapa aspek kritis: (i) kerentanan keamanan warisan seperti SQL injection dan penyimpanan password MD5/SHA1 tanpa salt; (ii) ketiadaan jejak rekam audit (audit trail); (iii) ketiadaan antarmuka REST API; dan (iv) ketiadaan pengujian otomatis (automated test coverage).</w:t>
+        <w:t>Sesuai dengan Hukum Evolusi Perangkat Lunak Lehman (Lehman's Laws of Software Evolution), suatu sistem perangkat lunak yang beroperasi di lingkungan dunia nyata harus terus diadaptasikan secara berkelanjutan; jika tidak, sistem tersebut akan mengalami degradasi kualitas dan utilitas yang semakin tinggi (Lehman, 1996). Alih-alih membangun sistem dari nol (scratch rewrite) yang berisiko membuang logika domain kearsipan yang telah terbukti fungsional sejak rilis 2017, pendekatan software re-engineering dipilih sebagai strategi terstruktur, hemat biaya, dan minim risiko regresi untuk mentransformasikan Arteri-1 menjadi Arteri-2 dengan tumpukan teknologi CodeIgniter 4 dan PHP 8.x.</w:t>
       </w:r>
     </w:p>
     <w:p>

</xml_diff>

<commit_message>
docs: remove public sector phrasing, embed high-res DSR methodology diagram image
</commit_message>
<xml_diff>
--- a/docs/modernization/Draft_Artikel_Modernisasi_Arteri2.docx
+++ b/docs/modernization/Draft_Artikel_Modernisasi_Arteri2.docx
@@ -337,15 +337,74 @@
           <w:rFonts w:ascii="Times New Roman" w:hAnsi="Times New Roman"/>
           <w:sz w:val="22"/>
         </w:rPr>
-        <w:t>Penelitian ini mengadopsi metode Design Science Research (DSR) (Peffers et al., 2007) yang dipadukan dengan siklus Re-engineering Chikofsky dan Cross (1990) dalam empat tahapan:</w:t>
-        <w:br/>
-        <w:t>1. Identifikasi Masalah &amp; Audit Sistem Warisan (Reverse Engineering)</w:t>
-        <w:br/>
-        <w:t>2. Perancangan Arsitektur Target &amp; Spesifikasi Solusi (Restructuring)</w:t>
-        <w:br/>
-        <w:t>3. Rekayasa Maju &amp; Implementasi Fitur Baru (Forward Engineering)</w:t>
-        <w:br/>
-        <w:t>4. Demonstrasi &amp; Evaluasi Kualitas (ISO/IEC 25010 &amp; OWASP Top 10)</w:t>
+        <w:t>Penelitian ini mengadopsi metode Design Science Research (DSR) (Peffers et al., 2007) yang dipadukan dengan siklus Re-engineering Chikofsky dan Cross (1990) dalam empat tahapan operasional:</w:t>
+      </w:r>
+    </w:p>
+    <w:p>
+      <w:pPr>
+        <w:spacing w:before="160" w:after="80"/>
+        <w:jc w:val="center"/>
+      </w:pPr>
+      <w:r>
+        <w:drawing>
+          <wp:inline xmlns:a="http://schemas.openxmlformats.org/drawingml/2006/main" xmlns:pic="http://schemas.openxmlformats.org/drawingml/2006/picture">
+            <wp:extent cx="5669280" cy="3401568"/>
+            <wp:docPr id="1" name="Picture 1"/>
+            <wp:cNvGraphicFramePr>
+              <a:graphicFrameLocks noChangeAspect="1"/>
+            </wp:cNvGraphicFramePr>
+            <a:graphic>
+              <a:graphicData uri="http://schemas.openxmlformats.org/drawingml/2006/picture">
+                <pic:pic>
+                  <pic:nvPicPr>
+                    <pic:cNvPr id="0" name="dsr_methodology_flow.png"/>
+                    <pic:cNvPicPr/>
+                  </pic:nvPicPr>
+                  <pic:blipFill>
+                    <a:blip r:embed="rId9"/>
+                    <a:stretch>
+                      <a:fillRect/>
+                    </a:stretch>
+                  </pic:blipFill>
+                  <pic:spPr>
+                    <a:xfrm>
+                      <a:off x="0" y="0"/>
+                      <a:ext cx="5669280" cy="3401568"/>
+                    </a:xfrm>
+                    <a:prstGeom prst="rect"/>
+                  </pic:spPr>
+                </pic:pic>
+              </a:graphicData>
+            </a:graphic>
+          </wp:inline>
+        </w:drawing>
+      </w:r>
+    </w:p>
+    <w:p>
+      <w:pPr>
+        <w:spacing w:after="200"/>
+        <w:jc w:val="center"/>
+      </w:pPr>
+      <w:r>
+        <w:rPr>
+          <w:rFonts w:ascii="Times New Roman" w:hAnsi="Times New Roman"/>
+          <w:i/>
+          <w:sz w:val="19"/>
+        </w:rPr>
+        <w:t>Gambar 1. Kerangka Metodologi Rekayasa Ulang Arteri (DSR + Re-engineering Lifecycle)</w:t>
+      </w:r>
+    </w:p>
+    <w:p>
+      <w:pPr>
+        <w:spacing w:after="120" w:line="276" w:lineRule="auto"/>
+        <w:jc w:val="both"/>
+      </w:pPr>
+      <w:r>
+        <w:rPr>
+          <w:rFonts w:ascii="Times New Roman" w:hAnsi="Times New Roman"/>
+          <w:sz w:val="22"/>
+        </w:rPr>
+        <w:t>Empat tahapan terstruktur tersebut mencakup:\n1. Identifikasi Masalah &amp; Audit Sistem Warisan (Reverse Engineering): Melakukan audit menyeluruh terhadap kode sumber repositori Arteri-1 (CodeIgniter 3.1.x), mengidentifikasi kerentanan keamanan warisan (injeksi SQL, hashing kata sandi MD5/SHA1, ketiadaan proteksi CSRF), merekonstruksi model relasional basis data (data_arsip, master_kode, sirkulasi), serta memetakan technical debt dan dependensi PHP EOL.\n2. Perancangan Arsitektur Target &amp; Spesifikasi Solusi (Restructuring): Merancang ulang struktur direktori aplikasi dengan memisahkan document root publik (public/index.php) dari logika inti aplikasi (app/), memigrasikan arsitektur ke CodeIgniter 4 berbasis autoloading PSR-4, menegakkan deklarasi tipe data ketat (strict typing) pada PHP 8.4, dan menyusun skrip migrasi basis data deklaratif yang kompatibel secara agnostik dengan MySQL maupun SQLite.\n3. Rekayasa Maju &amp; Implementasi Fitur Baru (Forward Engineering): Membangun mekanisme mitigasi OWASP Top 10 (enkripsi Bcrypt, Auth Filter, Secure File Serving), modul pencatatan jejak audit (SystemLog), modul pemulihan data terhapus (Soft Deletes / Trash), serta merancang dan mengimplementasikan antarmuka RESTful API v1 terstandar OpenAPI 3.0 dengan pengamanan API Key berbasis SHA-256 dan pembatasan laju kueri (rate limiting).\n4. Demonstrasi &amp; Evaluasi Kualitas (Evaluation): Mengeksekusi rangkaian pengujian regresi otomatis (test suite) berbasis PHPUnit 11, mengevaluasi karakteristik kualitas sistem mengacu pada standar ISO/IEC 25010 (Maintainability, Security, Compatibility, Functional Suitability, dan Interoperability), serta memverifikasi kepatuhan pengerasan keamanan terhadap matriks risiko OWASP Top 10.</w:t>
       </w:r>
     </w:p>
     <w:p>

</xml_diff>